<commit_message>
add cross-platform build scripts and enhance functionality for form generation
</commit_message>
<xml_diff>
--- a/Fahrtkostenerstattung_Familienheimfahrt.docx
+++ b/Fahrtkostenerstattung_Familienheimfahrt.docx
@@ -1,6 +1,6 @@
 
 <file path=word/document.xml><?xml version="1.0" encoding="utf-8"?>
-<w:document xmlns:wpc="http://schemas.microsoft.com/office/word/2010/wordprocessingCanvas" xmlns:cx="http://schemas.microsoft.com/office/drawing/2014/chartex" xmlns:cx1="http://schemas.microsoft.com/office/drawing/2015/9/8/chartex" xmlns:cx2="http://schemas.microsoft.com/office/drawing/2015/10/21/chartex" xmlns:cx3="http://schemas.microsoft.com/office/drawing/2016/5/9/chartex" xmlns:cx4="http://schemas.microsoft.com/office/drawing/2016/5/10/chartex" xmlns:cx5="http://schemas.microsoft.com/office/drawing/2016/5/11/chartex" xmlns:cx6="http://schemas.microsoft.com/office/drawing/2016/5/12/chartex" xmlns:cx7="http://schemas.microsoft.com/office/drawing/2016/5/13/chartex" xmlns:cx8="http://schemas.microsoft.com/office/drawing/2016/5/14/chartex" xmlns:mc="http://schemas.openxmlformats.org/markup-compatibility/2006" xmlns:aink="http://schemas.microsoft.com/office/drawing/2016/ink" xmlns:am3d="http://schemas.microsoft.com/office/drawing/2017/model3d" xmlns:o="urn:schemas-microsoft-com:office:office" xmlns:oel="http://schemas.microsoft.com/office/2019/extlst" xmlns:r="http://schemas.openxmlformats.org/officeDocument/2006/relationships" xmlns:m="http://schemas.openxmlformats.org/officeDocument/2006/math" xmlns:v="urn:schemas-microsoft-com:vml" xmlns:wp14="http://schemas.microsoft.com/office/word/2010/wordprocessingDrawing" xmlns:wp="http://schemas.openxmlformats.org/drawingml/2006/wordprocessingDrawing" xmlns:w10="urn:schemas-microsoft-com:office:word" xmlns:w="http://schemas.openxmlformats.org/wordprocessingml/2006/main" xmlns:w14="http://schemas.microsoft.com/office/word/2010/wordml" xmlns:w15="http://schemas.microsoft.com/office/word/2012/wordml" xmlns:w16cex="http://schemas.microsoft.com/office/word/2018/wordml/cex" xmlns:w16cid="http://schemas.microsoft.com/office/word/2016/wordml/cid" xmlns:w16="http://schemas.microsoft.com/office/word/2018/wordml" xmlns:w16du="http://schemas.microsoft.com/office/word/2023/wordml/word16du" xmlns:w16sdtdh="http://schemas.microsoft.com/office/word/2020/wordml/sdtdatahash" xmlns:w16sdtfl="http://schemas.microsoft.com/office/word/2024/wordml/sdtformatlock" xmlns:w16se="http://schemas.microsoft.com/office/word/2015/wordml/symex" xmlns:wpg="http://schemas.microsoft.com/office/word/2010/wordprocessingGroup" xmlns:wpi="http://schemas.microsoft.com/office/word/2010/wordprocessingInk" xmlns:wne="http://schemas.microsoft.com/office/word/2006/wordml" xmlns:wps="http://schemas.microsoft.com/office/word/2010/wordprocessingShape" mc:Ignorable="w14 w15 w16se w16cid w16 w16cex w16sdtdh w16sdtfl w16du wp14">
+<w:document xmlns:wpc="http://schemas.microsoft.com/office/word/2010/wordprocessingCanvas" xmlns:cx="http://schemas.microsoft.com/office/drawing/2014/chartex" xmlns:cx1="http://schemas.microsoft.com/office/drawing/2015/9/8/chartex" xmlns:cx2="http://schemas.microsoft.com/office/drawing/2015/10/21/chartex" xmlns:cx3="http://schemas.microsoft.com/office/drawing/2016/5/9/chartex" xmlns:cx4="http://schemas.microsoft.com/office/drawing/2016/5/10/chartex" xmlns:cx5="http://schemas.microsoft.com/office/drawing/2016/5/11/chartex" xmlns:cx6="http://schemas.microsoft.com/office/drawing/2016/5/12/chartex" xmlns:cx7="http://schemas.microsoft.com/office/drawing/2016/5/13/chartex" xmlns:cx8="http://schemas.microsoft.com/office/drawing/2016/5/14/chartex" xmlns:mc="http://schemas.openxmlformats.org/markup-compatibility/2006" xmlns:m="http://schemas.openxmlformats.org/officeDocument/2006/math" xmlns:aink="http://schemas.microsoft.com/office/drawing/2016/ink" xmlns:am3d="http://schemas.microsoft.com/office/drawing/2017/model3d" xmlns:oel="http://schemas.microsoft.com/office/2019/extlst" xmlns:r="http://schemas.openxmlformats.org/officeDocument/2006/relationships" xmlns:wp14="http://schemas.microsoft.com/office/word/2010/wordprocessingDrawing" xmlns:wp="http://schemas.openxmlformats.org/drawingml/2006/wordprocessingDrawing" xmlns:wpg="http://schemas.microsoft.com/office/word/2010/wordprocessingGroup" xmlns:wpi="http://schemas.microsoft.com/office/word/2010/wordprocessingInk" xmlns:wps="http://schemas.microsoft.com/office/word/2010/wordprocessingShape" xmlns:o="urn:schemas-microsoft-com:office:office" xmlns:v="urn:schemas-microsoft-com:vml" xmlns:w10="urn:schemas-microsoft-com:office:word" xmlns:w="http://schemas.openxmlformats.org/wordprocessingml/2006/main" xmlns:w14="http://schemas.microsoft.com/office/word/2010/wordml" xmlns:w15="http://schemas.microsoft.com/office/word/2012/wordml" xmlns:w16cei="http://schemas.microsoft.com/office/word/2026/wordml/cei" xmlns:w16cex="http://schemas.microsoft.com/office/word/2018/wordml/cex" xmlns:w16cid="http://schemas.microsoft.com/office/word/2016/wordml/cid" xmlns:w16="http://schemas.microsoft.com/office/word/2018/wordml" xmlns:w16sdtdh="http://schemas.microsoft.com/office/word/2020/wordml/sdtdatahash" xmlns:w16sdtfl="http://schemas.microsoft.com/office/word/2024/wordml/sdtformatlock" xmlns:w16se="http://schemas.microsoft.com/office/word/2015/wordml/symex" xmlns:w16du="http://schemas.microsoft.com/office/word/2023/wordml/word16du" xmlns:wne="http://schemas.microsoft.com/office/word/2006/wordml" mc:Ignorable="w14 w15 w16se w16cid w16 w16cex w16sdtdh w16sdtfl w16du wp14">
   <w:body>
     <w:p>
       <w:pPr>
@@ -425,6 +425,7 @@
           <w:p>
             <w:pPr>
               <w:rPr>
+                <w:bCs/>
                 <w:lang w:val="de-DE"/>
               </w:rPr>
             </w:pPr>
@@ -442,38 +443,18 @@
               </w:rPr>
               <w:t xml:space="preserve"> </w:t>
             </w:r>
-            <w:sdt>
-              <w:sdtPr>
-                <w:rPr>
-                  <w:b/>
-                  <w:lang w:val="de-DE"/>
-                </w:rPr>
-                <w:id w:val="1729962757"/>
-                <w:placeholder>
-                  <w:docPart w:val="FB80503417AF4E04B5347EC496624C8D"/>
-                </w:placeholder>
-                <w:date w:fullDate="2026-03-26T00:00:00Z">
-                  <w:dateFormat w:val="dd.MM.yyyy"/>
-                  <w:lid w:val="de-DE"/>
-                  <w:storeMappedDataAs w:val="dateTime"/>
-                  <w:calendar w:val="gregorian"/>
-                </w:date>
-              </w:sdtPr>
-              <w:sdtContent>
-                <w:r>
-                  <w:rPr>
-                    <w:b/>
-                    <w:lang w:val="de-DE"/>
-                  </w:rPr>
-                  <w:t>26.03.2026</w:t>
-                </w:r>
-              </w:sdtContent>
-            </w:sdt>
             <w:r>
               <w:rPr>
                 <w:bCs/>
                 <w:lang w:val="de-DE"/>
               </w:rPr>
+              <w:t>{DATUM_AUSB_ANF}</w:t>
+            </w:r>
+            <w:r>
+              <w:rPr>
+                <w:bCs/>
+                <w:lang w:val="de-DE"/>
+              </w:rPr>
               <w:t xml:space="preserve"> </w:t>
             </w:r>
             <w:r>
@@ -490,39 +471,12 @@
               </w:rPr>
               <w:t xml:space="preserve"> </w:t>
             </w:r>
-            <w:sdt>
-              <w:sdtPr>
-                <w:rPr>
-                  <w:b/>
-                  <w:lang w:val="de-DE"/>
-                </w:rPr>
-                <w:id w:val="2077161657"/>
-                <w:placeholder>
-                  <w:docPart w:val="9E2DA37932E84E0486F2EAF7E55FCDCB"/>
-                </w:placeholder>
-                <w:date w:fullDate="2028-06-21T00:00:00Z">
-                  <w:dateFormat w:val="dd.MM.yyyy"/>
-                  <w:lid w:val="de-DE"/>
-                  <w:storeMappedDataAs w:val="dateTime"/>
-                  <w:calendar w:val="gregorian"/>
-                </w:date>
-              </w:sdtPr>
-              <w:sdtContent>
-                <w:r>
-                  <w:rPr>
-                    <w:b/>
-                    <w:lang w:val="de-DE"/>
-                  </w:rPr>
-                  <w:t>21.06.2028</w:t>
-                </w:r>
-              </w:sdtContent>
-            </w:sdt>
-            <w:r>
-              <w:rPr>
-                <w:b/>
-                <w:lang w:val="de-DE"/>
-              </w:rPr>
-              <w:t xml:space="preserve"> </w:t>
+            <w:r>
+              <w:rPr>
+                <w:bCs/>
+                <w:lang w:val="de-DE"/>
+              </w:rPr>
+              <w:t>{DATUM_AUSB_ENDE}</w:t>
             </w:r>
           </w:p>
         </w:tc>
@@ -1477,7 +1431,7 @@
 </file>
 
 <file path=word/endnotes.xml><?xml version="1.0" encoding="utf-8"?>
-<w:endnotes xmlns:wpc="http://schemas.microsoft.com/office/word/2010/wordprocessingCanvas" xmlns:cx="http://schemas.microsoft.com/office/drawing/2014/chartex" xmlns:cx1="http://schemas.microsoft.com/office/drawing/2015/9/8/chartex" xmlns:cx2="http://schemas.microsoft.com/office/drawing/2015/10/21/chartex" xmlns:cx3="http://schemas.microsoft.com/office/drawing/2016/5/9/chartex" xmlns:cx4="http://schemas.microsoft.com/office/drawing/2016/5/10/chartex" xmlns:cx5="http://schemas.microsoft.com/office/drawing/2016/5/11/chartex" xmlns:cx6="http://schemas.microsoft.com/office/drawing/2016/5/12/chartex" xmlns:cx7="http://schemas.microsoft.com/office/drawing/2016/5/13/chartex" xmlns:cx8="http://schemas.microsoft.com/office/drawing/2016/5/14/chartex" xmlns:mc="http://schemas.openxmlformats.org/markup-compatibility/2006" xmlns:aink="http://schemas.microsoft.com/office/drawing/2016/ink" xmlns:am3d="http://schemas.microsoft.com/office/drawing/2017/model3d" xmlns:o="urn:schemas-microsoft-com:office:office" xmlns:oel="http://schemas.microsoft.com/office/2019/extlst" xmlns:r="http://schemas.openxmlformats.org/officeDocument/2006/relationships" xmlns:m="http://schemas.openxmlformats.org/officeDocument/2006/math" xmlns:v="urn:schemas-microsoft-com:vml" xmlns:wp14="http://schemas.microsoft.com/office/word/2010/wordprocessingDrawing" xmlns:wp="http://schemas.openxmlformats.org/drawingml/2006/wordprocessingDrawing" xmlns:w10="urn:schemas-microsoft-com:office:word" xmlns:w="http://schemas.openxmlformats.org/wordprocessingml/2006/main" xmlns:w14="http://schemas.microsoft.com/office/word/2010/wordml" xmlns:w15="http://schemas.microsoft.com/office/word/2012/wordml" xmlns:w16cex="http://schemas.microsoft.com/office/word/2018/wordml/cex" xmlns:w16cid="http://schemas.microsoft.com/office/word/2016/wordml/cid" xmlns:w16="http://schemas.microsoft.com/office/word/2018/wordml" xmlns:w16du="http://schemas.microsoft.com/office/word/2023/wordml/word16du" xmlns:w16sdtdh="http://schemas.microsoft.com/office/word/2020/wordml/sdtdatahash" xmlns:w16sdtfl="http://schemas.microsoft.com/office/word/2024/wordml/sdtformatlock" xmlns:w16se="http://schemas.microsoft.com/office/word/2015/wordml/symex" xmlns:wpg="http://schemas.microsoft.com/office/word/2010/wordprocessingGroup" xmlns:wpi="http://schemas.microsoft.com/office/word/2010/wordprocessingInk" xmlns:wne="http://schemas.microsoft.com/office/word/2006/wordml" xmlns:wps="http://schemas.microsoft.com/office/word/2010/wordprocessingShape" mc:Ignorable="w14 w15 w16se w16cid w16 w16cex w16sdtdh w16sdtfl w16du wp14">
+<w:endnotes xmlns:wpc="http://schemas.microsoft.com/office/word/2010/wordprocessingCanvas" xmlns:cx="http://schemas.microsoft.com/office/drawing/2014/chartex" xmlns:cx1="http://schemas.microsoft.com/office/drawing/2015/9/8/chartex" xmlns:cx2="http://schemas.microsoft.com/office/drawing/2015/10/21/chartex" xmlns:cx3="http://schemas.microsoft.com/office/drawing/2016/5/9/chartex" xmlns:cx4="http://schemas.microsoft.com/office/drawing/2016/5/10/chartex" xmlns:cx5="http://schemas.microsoft.com/office/drawing/2016/5/11/chartex" xmlns:cx6="http://schemas.microsoft.com/office/drawing/2016/5/12/chartex" xmlns:cx7="http://schemas.microsoft.com/office/drawing/2016/5/13/chartex" xmlns:cx8="http://schemas.microsoft.com/office/drawing/2016/5/14/chartex" xmlns:mc="http://schemas.openxmlformats.org/markup-compatibility/2006" xmlns:m="http://schemas.openxmlformats.org/officeDocument/2006/math" xmlns:aink="http://schemas.microsoft.com/office/drawing/2016/ink" xmlns:am3d="http://schemas.microsoft.com/office/drawing/2017/model3d" xmlns:oel="http://schemas.microsoft.com/office/2019/extlst" xmlns:r="http://schemas.openxmlformats.org/officeDocument/2006/relationships" xmlns:wp14="http://schemas.microsoft.com/office/word/2010/wordprocessingDrawing" xmlns:wp="http://schemas.openxmlformats.org/drawingml/2006/wordprocessingDrawing" xmlns:wpg="http://schemas.microsoft.com/office/word/2010/wordprocessingGroup" xmlns:wpi="http://schemas.microsoft.com/office/word/2010/wordprocessingInk" xmlns:wps="http://schemas.microsoft.com/office/word/2010/wordprocessingShape" xmlns:o="urn:schemas-microsoft-com:office:office" xmlns:v="urn:schemas-microsoft-com:vml" xmlns:w10="urn:schemas-microsoft-com:office:word" xmlns:w="http://schemas.openxmlformats.org/wordprocessingml/2006/main" xmlns:w14="http://schemas.microsoft.com/office/word/2010/wordml" xmlns:w15="http://schemas.microsoft.com/office/word/2012/wordml" xmlns:w16cei="http://schemas.microsoft.com/office/word/2026/wordml/cei" xmlns:w16cex="http://schemas.microsoft.com/office/word/2018/wordml/cex" xmlns:w16cid="http://schemas.microsoft.com/office/word/2016/wordml/cid" xmlns:w16="http://schemas.microsoft.com/office/word/2018/wordml" xmlns:w16sdtdh="http://schemas.microsoft.com/office/word/2020/wordml/sdtdatahash" xmlns:w16sdtfl="http://schemas.microsoft.com/office/word/2024/wordml/sdtformatlock" xmlns:w16se="http://schemas.microsoft.com/office/word/2015/wordml/symex" xmlns:w16du="http://schemas.microsoft.com/office/word/2023/wordml/word16du" xmlns:wne="http://schemas.microsoft.com/office/word/2006/wordml" mc:Ignorable="w14 w15 w16se w16cid w16 w16cex w16sdtdh w16sdtfl w16du wp14">
   <w:endnote w:type="separator" w:id="-1">
     <w:p>
       <w:r>
@@ -1496,7 +1450,7 @@
 </file>
 
 <file path=word/footer1.xml><?xml version="1.0" encoding="utf-8"?>
-<w:ftr xmlns:wpc="http://schemas.microsoft.com/office/word/2010/wordprocessingCanvas" xmlns:cx="http://schemas.microsoft.com/office/drawing/2014/chartex" xmlns:cx1="http://schemas.microsoft.com/office/drawing/2015/9/8/chartex" xmlns:cx2="http://schemas.microsoft.com/office/drawing/2015/10/21/chartex" xmlns:cx3="http://schemas.microsoft.com/office/drawing/2016/5/9/chartex" xmlns:cx4="http://schemas.microsoft.com/office/drawing/2016/5/10/chartex" xmlns:cx5="http://schemas.microsoft.com/office/drawing/2016/5/11/chartex" xmlns:cx6="http://schemas.microsoft.com/office/drawing/2016/5/12/chartex" xmlns:cx7="http://schemas.microsoft.com/office/drawing/2016/5/13/chartex" xmlns:cx8="http://schemas.microsoft.com/office/drawing/2016/5/14/chartex" xmlns:mc="http://schemas.openxmlformats.org/markup-compatibility/2006" xmlns:aink="http://schemas.microsoft.com/office/drawing/2016/ink" xmlns:am3d="http://schemas.microsoft.com/office/drawing/2017/model3d" xmlns:o="urn:schemas-microsoft-com:office:office" xmlns:oel="http://schemas.microsoft.com/office/2019/extlst" xmlns:r="http://schemas.openxmlformats.org/officeDocument/2006/relationships" xmlns:m="http://schemas.openxmlformats.org/officeDocument/2006/math" xmlns:v="urn:schemas-microsoft-com:vml" xmlns:wp14="http://schemas.microsoft.com/office/word/2010/wordprocessingDrawing" xmlns:wp="http://schemas.openxmlformats.org/drawingml/2006/wordprocessingDrawing" xmlns:w10="urn:schemas-microsoft-com:office:word" xmlns:w="http://schemas.openxmlformats.org/wordprocessingml/2006/main" xmlns:w14="http://schemas.microsoft.com/office/word/2010/wordml" xmlns:w15="http://schemas.microsoft.com/office/word/2012/wordml" xmlns:w16cex="http://schemas.microsoft.com/office/word/2018/wordml/cex" xmlns:w16cid="http://schemas.microsoft.com/office/word/2016/wordml/cid" xmlns:w16="http://schemas.microsoft.com/office/word/2018/wordml" xmlns:w16du="http://schemas.microsoft.com/office/word/2023/wordml/word16du" xmlns:w16sdtdh="http://schemas.microsoft.com/office/word/2020/wordml/sdtdatahash" xmlns:w16sdtfl="http://schemas.microsoft.com/office/word/2024/wordml/sdtformatlock" xmlns:w16se="http://schemas.microsoft.com/office/word/2015/wordml/symex" xmlns:wpg="http://schemas.microsoft.com/office/word/2010/wordprocessingGroup" xmlns:wpi="http://schemas.microsoft.com/office/word/2010/wordprocessingInk" xmlns:wne="http://schemas.microsoft.com/office/word/2006/wordml" xmlns:wps="http://schemas.microsoft.com/office/word/2010/wordprocessingShape" mc:Ignorable="w14 w15 w16se w16cid w16 w16cex w16sdtdh w16sdtfl w16du wp14">
+<w:ftr xmlns:wpc="http://schemas.microsoft.com/office/word/2010/wordprocessingCanvas" xmlns:cx="http://schemas.microsoft.com/office/drawing/2014/chartex" xmlns:cx1="http://schemas.microsoft.com/office/drawing/2015/9/8/chartex" xmlns:cx2="http://schemas.microsoft.com/office/drawing/2015/10/21/chartex" xmlns:cx3="http://schemas.microsoft.com/office/drawing/2016/5/9/chartex" xmlns:cx4="http://schemas.microsoft.com/office/drawing/2016/5/10/chartex" xmlns:cx5="http://schemas.microsoft.com/office/drawing/2016/5/11/chartex" xmlns:cx6="http://schemas.microsoft.com/office/drawing/2016/5/12/chartex" xmlns:cx7="http://schemas.microsoft.com/office/drawing/2016/5/13/chartex" xmlns:cx8="http://schemas.microsoft.com/office/drawing/2016/5/14/chartex" xmlns:mc="http://schemas.openxmlformats.org/markup-compatibility/2006" xmlns:m="http://schemas.openxmlformats.org/officeDocument/2006/math" xmlns:aink="http://schemas.microsoft.com/office/drawing/2016/ink" xmlns:am3d="http://schemas.microsoft.com/office/drawing/2017/model3d" xmlns:oel="http://schemas.microsoft.com/office/2019/extlst" xmlns:r="http://schemas.openxmlformats.org/officeDocument/2006/relationships" xmlns:wp14="http://schemas.microsoft.com/office/word/2010/wordprocessingDrawing" xmlns:wp="http://schemas.openxmlformats.org/drawingml/2006/wordprocessingDrawing" xmlns:wpg="http://schemas.microsoft.com/office/word/2010/wordprocessingGroup" xmlns:wpi="http://schemas.microsoft.com/office/word/2010/wordprocessingInk" xmlns:wps="http://schemas.microsoft.com/office/word/2010/wordprocessingShape" xmlns:o="urn:schemas-microsoft-com:office:office" xmlns:v="urn:schemas-microsoft-com:vml" xmlns:w10="urn:schemas-microsoft-com:office:word" xmlns:w="http://schemas.openxmlformats.org/wordprocessingml/2006/main" xmlns:w14="http://schemas.microsoft.com/office/word/2010/wordml" xmlns:w15="http://schemas.microsoft.com/office/word/2012/wordml" xmlns:w16cei="http://schemas.microsoft.com/office/word/2026/wordml/cei" xmlns:w16cex="http://schemas.microsoft.com/office/word/2018/wordml/cex" xmlns:w16cid="http://schemas.microsoft.com/office/word/2016/wordml/cid" xmlns:w16="http://schemas.microsoft.com/office/word/2018/wordml" xmlns:w16sdtdh="http://schemas.microsoft.com/office/word/2020/wordml/sdtdatahash" xmlns:w16sdtfl="http://schemas.microsoft.com/office/word/2024/wordml/sdtformatlock" xmlns:w16se="http://schemas.microsoft.com/office/word/2015/wordml/symex" xmlns:w16du="http://schemas.microsoft.com/office/word/2023/wordml/word16du" xmlns:wne="http://schemas.microsoft.com/office/word/2006/wordml" mc:Ignorable="w14 w15 w16se w16cid w16 w16cex w16sdtdh w16sdtfl w16du wp14">
   <w:tbl>
     <w:tblPr>
       <w:tblStyle w:val="Tabellenraster"/>
@@ -1581,7 +1535,7 @@
 </file>
 
 <file path=word/footnotes.xml><?xml version="1.0" encoding="utf-8"?>
-<w:footnotes xmlns:wpc="http://schemas.microsoft.com/office/word/2010/wordprocessingCanvas" xmlns:cx="http://schemas.microsoft.com/office/drawing/2014/chartex" xmlns:cx1="http://schemas.microsoft.com/office/drawing/2015/9/8/chartex" xmlns:cx2="http://schemas.microsoft.com/office/drawing/2015/10/21/chartex" xmlns:cx3="http://schemas.microsoft.com/office/drawing/2016/5/9/chartex" xmlns:cx4="http://schemas.microsoft.com/office/drawing/2016/5/10/chartex" xmlns:cx5="http://schemas.microsoft.com/office/drawing/2016/5/11/chartex" xmlns:cx6="http://schemas.microsoft.com/office/drawing/2016/5/12/chartex" xmlns:cx7="http://schemas.microsoft.com/office/drawing/2016/5/13/chartex" xmlns:cx8="http://schemas.microsoft.com/office/drawing/2016/5/14/chartex" xmlns:mc="http://schemas.openxmlformats.org/markup-compatibility/2006" xmlns:aink="http://schemas.microsoft.com/office/drawing/2016/ink" xmlns:am3d="http://schemas.microsoft.com/office/drawing/2017/model3d" xmlns:o="urn:schemas-microsoft-com:office:office" xmlns:oel="http://schemas.microsoft.com/office/2019/extlst" xmlns:r="http://schemas.openxmlformats.org/officeDocument/2006/relationships" xmlns:m="http://schemas.openxmlformats.org/officeDocument/2006/math" xmlns:v="urn:schemas-microsoft-com:vml" xmlns:wp14="http://schemas.microsoft.com/office/word/2010/wordprocessingDrawing" xmlns:wp="http://schemas.openxmlformats.org/drawingml/2006/wordprocessingDrawing" xmlns:w10="urn:schemas-microsoft-com:office:word" xmlns:w="http://schemas.openxmlformats.org/wordprocessingml/2006/main" xmlns:w14="http://schemas.microsoft.com/office/word/2010/wordml" xmlns:w15="http://schemas.microsoft.com/office/word/2012/wordml" xmlns:w16cex="http://schemas.microsoft.com/office/word/2018/wordml/cex" xmlns:w16cid="http://schemas.microsoft.com/office/word/2016/wordml/cid" xmlns:w16="http://schemas.microsoft.com/office/word/2018/wordml" xmlns:w16du="http://schemas.microsoft.com/office/word/2023/wordml/word16du" xmlns:w16sdtdh="http://schemas.microsoft.com/office/word/2020/wordml/sdtdatahash" xmlns:w16sdtfl="http://schemas.microsoft.com/office/word/2024/wordml/sdtformatlock" xmlns:w16se="http://schemas.microsoft.com/office/word/2015/wordml/symex" xmlns:wpg="http://schemas.microsoft.com/office/word/2010/wordprocessingGroup" xmlns:wpi="http://schemas.microsoft.com/office/word/2010/wordprocessingInk" xmlns:wne="http://schemas.microsoft.com/office/word/2006/wordml" xmlns:wps="http://schemas.microsoft.com/office/word/2010/wordprocessingShape" mc:Ignorable="w14 w15 w16se w16cid w16 w16cex w16sdtdh w16sdtfl w16du wp14">
+<w:footnotes xmlns:wpc="http://schemas.microsoft.com/office/word/2010/wordprocessingCanvas" xmlns:cx="http://schemas.microsoft.com/office/drawing/2014/chartex" xmlns:cx1="http://schemas.microsoft.com/office/drawing/2015/9/8/chartex" xmlns:cx2="http://schemas.microsoft.com/office/drawing/2015/10/21/chartex" xmlns:cx3="http://schemas.microsoft.com/office/drawing/2016/5/9/chartex" xmlns:cx4="http://schemas.microsoft.com/office/drawing/2016/5/10/chartex" xmlns:cx5="http://schemas.microsoft.com/office/drawing/2016/5/11/chartex" xmlns:cx6="http://schemas.microsoft.com/office/drawing/2016/5/12/chartex" xmlns:cx7="http://schemas.microsoft.com/office/drawing/2016/5/13/chartex" xmlns:cx8="http://schemas.microsoft.com/office/drawing/2016/5/14/chartex" xmlns:mc="http://schemas.openxmlformats.org/markup-compatibility/2006" xmlns:m="http://schemas.openxmlformats.org/officeDocument/2006/math" xmlns:aink="http://schemas.microsoft.com/office/drawing/2016/ink" xmlns:am3d="http://schemas.microsoft.com/office/drawing/2017/model3d" xmlns:oel="http://schemas.microsoft.com/office/2019/extlst" xmlns:r="http://schemas.openxmlformats.org/officeDocument/2006/relationships" xmlns:wp14="http://schemas.microsoft.com/office/word/2010/wordprocessingDrawing" xmlns:wp="http://schemas.openxmlformats.org/drawingml/2006/wordprocessingDrawing" xmlns:wpg="http://schemas.microsoft.com/office/word/2010/wordprocessingGroup" xmlns:wpi="http://schemas.microsoft.com/office/word/2010/wordprocessingInk" xmlns:wps="http://schemas.microsoft.com/office/word/2010/wordprocessingShape" xmlns:o="urn:schemas-microsoft-com:office:office" xmlns:v="urn:schemas-microsoft-com:vml" xmlns:w10="urn:schemas-microsoft-com:office:word" xmlns:w="http://schemas.openxmlformats.org/wordprocessingml/2006/main" xmlns:w14="http://schemas.microsoft.com/office/word/2010/wordml" xmlns:w15="http://schemas.microsoft.com/office/word/2012/wordml" xmlns:w16cei="http://schemas.microsoft.com/office/word/2026/wordml/cei" xmlns:w16cex="http://schemas.microsoft.com/office/word/2018/wordml/cex" xmlns:w16cid="http://schemas.microsoft.com/office/word/2016/wordml/cid" xmlns:w16="http://schemas.microsoft.com/office/word/2018/wordml" xmlns:w16sdtdh="http://schemas.microsoft.com/office/word/2020/wordml/sdtdatahash" xmlns:w16sdtfl="http://schemas.microsoft.com/office/word/2024/wordml/sdtformatlock" xmlns:w16se="http://schemas.microsoft.com/office/word/2015/wordml/symex" xmlns:w16du="http://schemas.microsoft.com/office/word/2023/wordml/word16du" xmlns:wne="http://schemas.microsoft.com/office/word/2006/wordml" mc:Ignorable="w14 w15 w16se w16cid w16 w16cex w16sdtdh w16sdtfl w16du wp14">
   <w:footnote w:type="separator" w:id="-1">
     <w:p>
       <w:r>
@@ -1600,7 +1554,7 @@
 </file>
 
 <file path=word/header1.xml><?xml version="1.0" encoding="utf-8"?>
-<w:hdr xmlns:wpc="http://schemas.microsoft.com/office/word/2010/wordprocessingCanvas" xmlns:cx="http://schemas.microsoft.com/office/drawing/2014/chartex" xmlns:cx1="http://schemas.microsoft.com/office/drawing/2015/9/8/chartex" xmlns:cx2="http://schemas.microsoft.com/office/drawing/2015/10/21/chartex" xmlns:cx3="http://schemas.microsoft.com/office/drawing/2016/5/9/chartex" xmlns:cx4="http://schemas.microsoft.com/office/drawing/2016/5/10/chartex" xmlns:cx5="http://schemas.microsoft.com/office/drawing/2016/5/11/chartex" xmlns:cx6="http://schemas.microsoft.com/office/drawing/2016/5/12/chartex" xmlns:cx7="http://schemas.microsoft.com/office/drawing/2016/5/13/chartex" xmlns:cx8="http://schemas.microsoft.com/office/drawing/2016/5/14/chartex" xmlns:mc="http://schemas.openxmlformats.org/markup-compatibility/2006" xmlns:aink="http://schemas.microsoft.com/office/drawing/2016/ink" xmlns:am3d="http://schemas.microsoft.com/office/drawing/2017/model3d" xmlns:o="urn:schemas-microsoft-com:office:office" xmlns:oel="http://schemas.microsoft.com/office/2019/extlst" xmlns:r="http://schemas.openxmlformats.org/officeDocument/2006/relationships" xmlns:m="http://schemas.openxmlformats.org/officeDocument/2006/math" xmlns:v="urn:schemas-microsoft-com:vml" xmlns:wp14="http://schemas.microsoft.com/office/word/2010/wordprocessingDrawing" xmlns:wp="http://schemas.openxmlformats.org/drawingml/2006/wordprocessingDrawing" xmlns:w10="urn:schemas-microsoft-com:office:word" xmlns:w="http://schemas.openxmlformats.org/wordprocessingml/2006/main" xmlns:w14="http://schemas.microsoft.com/office/word/2010/wordml" xmlns:w15="http://schemas.microsoft.com/office/word/2012/wordml" xmlns:w16cex="http://schemas.microsoft.com/office/word/2018/wordml/cex" xmlns:w16cid="http://schemas.microsoft.com/office/word/2016/wordml/cid" xmlns:w16="http://schemas.microsoft.com/office/word/2018/wordml" xmlns:w16du="http://schemas.microsoft.com/office/word/2023/wordml/word16du" xmlns:w16sdtdh="http://schemas.microsoft.com/office/word/2020/wordml/sdtdatahash" xmlns:w16sdtfl="http://schemas.microsoft.com/office/word/2024/wordml/sdtformatlock" xmlns:w16se="http://schemas.microsoft.com/office/word/2015/wordml/symex" xmlns:wpg="http://schemas.microsoft.com/office/word/2010/wordprocessingGroup" xmlns:wpi="http://schemas.microsoft.com/office/word/2010/wordprocessingInk" xmlns:wne="http://schemas.microsoft.com/office/word/2006/wordml" xmlns:wps="http://schemas.microsoft.com/office/word/2010/wordprocessingShape" mc:Ignorable="w14 w15 w16se w16cid w16 w16cex w16sdtdh w16sdtfl w16du wp14">
+<w:hdr xmlns:wpc="http://schemas.microsoft.com/office/word/2010/wordprocessingCanvas" xmlns:cx="http://schemas.microsoft.com/office/drawing/2014/chartex" xmlns:cx1="http://schemas.microsoft.com/office/drawing/2015/9/8/chartex" xmlns:cx2="http://schemas.microsoft.com/office/drawing/2015/10/21/chartex" xmlns:cx3="http://schemas.microsoft.com/office/drawing/2016/5/9/chartex" xmlns:cx4="http://schemas.microsoft.com/office/drawing/2016/5/10/chartex" xmlns:cx5="http://schemas.microsoft.com/office/drawing/2016/5/11/chartex" xmlns:cx6="http://schemas.microsoft.com/office/drawing/2016/5/12/chartex" xmlns:cx7="http://schemas.microsoft.com/office/drawing/2016/5/13/chartex" xmlns:cx8="http://schemas.microsoft.com/office/drawing/2016/5/14/chartex" xmlns:mc="http://schemas.openxmlformats.org/markup-compatibility/2006" xmlns:m="http://schemas.openxmlformats.org/officeDocument/2006/math" xmlns:aink="http://schemas.microsoft.com/office/drawing/2016/ink" xmlns:am3d="http://schemas.microsoft.com/office/drawing/2017/model3d" xmlns:oel="http://schemas.microsoft.com/office/2019/extlst" xmlns:r="http://schemas.openxmlformats.org/officeDocument/2006/relationships" xmlns:wp14="http://schemas.microsoft.com/office/word/2010/wordprocessingDrawing" xmlns:wp="http://schemas.openxmlformats.org/drawingml/2006/wordprocessingDrawing" xmlns:wpg="http://schemas.microsoft.com/office/word/2010/wordprocessingGroup" xmlns:wpi="http://schemas.microsoft.com/office/word/2010/wordprocessingInk" xmlns:wps="http://schemas.microsoft.com/office/word/2010/wordprocessingShape" xmlns:o="urn:schemas-microsoft-com:office:office" xmlns:v="urn:schemas-microsoft-com:vml" xmlns:w10="urn:schemas-microsoft-com:office:word" xmlns:w="http://schemas.openxmlformats.org/wordprocessingml/2006/main" xmlns:w14="http://schemas.microsoft.com/office/word/2010/wordml" xmlns:w15="http://schemas.microsoft.com/office/word/2012/wordml" xmlns:w16cei="http://schemas.microsoft.com/office/word/2026/wordml/cei" xmlns:w16cex="http://schemas.microsoft.com/office/word/2018/wordml/cex" xmlns:w16cid="http://schemas.microsoft.com/office/word/2016/wordml/cid" xmlns:w16="http://schemas.microsoft.com/office/word/2018/wordml" xmlns:w16sdtdh="http://schemas.microsoft.com/office/word/2020/wordml/sdtdatahash" xmlns:w16sdtfl="http://schemas.microsoft.com/office/word/2024/wordml/sdtformatlock" xmlns:w16se="http://schemas.microsoft.com/office/word/2015/wordml/symex" xmlns:w16du="http://schemas.microsoft.com/office/word/2023/wordml/word16du" xmlns:wne="http://schemas.microsoft.com/office/word/2006/wordml" mc:Ignorable="w14 w15 w16se w16cid w16 w16cex w16sdtdh w16sdtfl w16du wp14">
   <w:p>
     <w:r>
       <w:rPr>
@@ -1671,7 +1625,7 @@
 </file>
 
 <file path=word/header2.xml><?xml version="1.0" encoding="utf-8"?>
-<w:hdr xmlns:wpc="http://schemas.microsoft.com/office/word/2010/wordprocessingCanvas" xmlns:cx="http://schemas.microsoft.com/office/drawing/2014/chartex" xmlns:cx1="http://schemas.microsoft.com/office/drawing/2015/9/8/chartex" xmlns:cx2="http://schemas.microsoft.com/office/drawing/2015/10/21/chartex" xmlns:cx3="http://schemas.microsoft.com/office/drawing/2016/5/9/chartex" xmlns:cx4="http://schemas.microsoft.com/office/drawing/2016/5/10/chartex" xmlns:cx5="http://schemas.microsoft.com/office/drawing/2016/5/11/chartex" xmlns:cx6="http://schemas.microsoft.com/office/drawing/2016/5/12/chartex" xmlns:cx7="http://schemas.microsoft.com/office/drawing/2016/5/13/chartex" xmlns:cx8="http://schemas.microsoft.com/office/drawing/2016/5/14/chartex" xmlns:mc="http://schemas.openxmlformats.org/markup-compatibility/2006" xmlns:aink="http://schemas.microsoft.com/office/drawing/2016/ink" xmlns:am3d="http://schemas.microsoft.com/office/drawing/2017/model3d" xmlns:o="urn:schemas-microsoft-com:office:office" xmlns:oel="http://schemas.microsoft.com/office/2019/extlst" xmlns:r="http://schemas.openxmlformats.org/officeDocument/2006/relationships" xmlns:m="http://schemas.openxmlformats.org/officeDocument/2006/math" xmlns:v="urn:schemas-microsoft-com:vml" xmlns:wp14="http://schemas.microsoft.com/office/word/2010/wordprocessingDrawing" xmlns:wp="http://schemas.openxmlformats.org/drawingml/2006/wordprocessingDrawing" xmlns:w10="urn:schemas-microsoft-com:office:word" xmlns:w="http://schemas.openxmlformats.org/wordprocessingml/2006/main" xmlns:w14="http://schemas.microsoft.com/office/word/2010/wordml" xmlns:w15="http://schemas.microsoft.com/office/word/2012/wordml" xmlns:w16cex="http://schemas.microsoft.com/office/word/2018/wordml/cex" xmlns:w16cid="http://schemas.microsoft.com/office/word/2016/wordml/cid" xmlns:w16="http://schemas.microsoft.com/office/word/2018/wordml" xmlns:w16du="http://schemas.microsoft.com/office/word/2023/wordml/word16du" xmlns:w16sdtdh="http://schemas.microsoft.com/office/word/2020/wordml/sdtdatahash" xmlns:w16sdtfl="http://schemas.microsoft.com/office/word/2024/wordml/sdtformatlock" xmlns:w16se="http://schemas.microsoft.com/office/word/2015/wordml/symex" xmlns:wpg="http://schemas.microsoft.com/office/word/2010/wordprocessingGroup" xmlns:wpi="http://schemas.microsoft.com/office/word/2010/wordprocessingInk" xmlns:wne="http://schemas.microsoft.com/office/word/2006/wordml" xmlns:wps="http://schemas.microsoft.com/office/word/2010/wordprocessingShape" mc:Ignorable="w14 w15 w16se w16cid w16 w16cex w16sdtdh w16sdtfl w16du wp14">
+<w:hdr xmlns:wpc="http://schemas.microsoft.com/office/word/2010/wordprocessingCanvas" xmlns:cx="http://schemas.microsoft.com/office/drawing/2014/chartex" xmlns:cx1="http://schemas.microsoft.com/office/drawing/2015/9/8/chartex" xmlns:cx2="http://schemas.microsoft.com/office/drawing/2015/10/21/chartex" xmlns:cx3="http://schemas.microsoft.com/office/drawing/2016/5/9/chartex" xmlns:cx4="http://schemas.microsoft.com/office/drawing/2016/5/10/chartex" xmlns:cx5="http://schemas.microsoft.com/office/drawing/2016/5/11/chartex" xmlns:cx6="http://schemas.microsoft.com/office/drawing/2016/5/12/chartex" xmlns:cx7="http://schemas.microsoft.com/office/drawing/2016/5/13/chartex" xmlns:cx8="http://schemas.microsoft.com/office/drawing/2016/5/14/chartex" xmlns:mc="http://schemas.openxmlformats.org/markup-compatibility/2006" xmlns:m="http://schemas.openxmlformats.org/officeDocument/2006/math" xmlns:aink="http://schemas.microsoft.com/office/drawing/2016/ink" xmlns:am3d="http://schemas.microsoft.com/office/drawing/2017/model3d" xmlns:oel="http://schemas.microsoft.com/office/2019/extlst" xmlns:r="http://schemas.openxmlformats.org/officeDocument/2006/relationships" xmlns:wp14="http://schemas.microsoft.com/office/word/2010/wordprocessingDrawing" xmlns:wp="http://schemas.openxmlformats.org/drawingml/2006/wordprocessingDrawing" xmlns:wpg="http://schemas.microsoft.com/office/word/2010/wordprocessingGroup" xmlns:wpi="http://schemas.microsoft.com/office/word/2010/wordprocessingInk" xmlns:wps="http://schemas.microsoft.com/office/word/2010/wordprocessingShape" xmlns:o="urn:schemas-microsoft-com:office:office" xmlns:v="urn:schemas-microsoft-com:vml" xmlns:w10="urn:schemas-microsoft-com:office:word" xmlns:w="http://schemas.openxmlformats.org/wordprocessingml/2006/main" xmlns:w14="http://schemas.microsoft.com/office/word/2010/wordml" xmlns:w15="http://schemas.microsoft.com/office/word/2012/wordml" xmlns:w16cei="http://schemas.microsoft.com/office/word/2026/wordml/cei" xmlns:w16cex="http://schemas.microsoft.com/office/word/2018/wordml/cex" xmlns:w16cid="http://schemas.microsoft.com/office/word/2016/wordml/cid" xmlns:w16="http://schemas.microsoft.com/office/word/2018/wordml" xmlns:w16sdtdh="http://schemas.microsoft.com/office/word/2020/wordml/sdtdatahash" xmlns:w16sdtfl="http://schemas.microsoft.com/office/word/2024/wordml/sdtformatlock" xmlns:w16se="http://schemas.microsoft.com/office/word/2015/wordml/symex" xmlns:w16du="http://schemas.microsoft.com/office/word/2023/wordml/word16du" xmlns:wne="http://schemas.microsoft.com/office/word/2006/wordml" mc:Ignorable="w14 w15 w16se w16cid w16 w16cex w16sdtdh w16sdtfl w16du wp14">
   <w:p>
     <w:pPr>
       <w:pStyle w:val="SRHEinrichtung"/>
@@ -1947,7 +1901,7 @@
 </file>
 
 <file path=word/numbering.xml><?xml version="1.0" encoding="utf-8"?>
-<w:numbering xmlns:wpc="http://schemas.microsoft.com/office/word/2010/wordprocessingCanvas" xmlns:cx="http://schemas.microsoft.com/office/drawing/2014/chartex" xmlns:cx1="http://schemas.microsoft.com/office/drawing/2015/9/8/chartex" xmlns:cx2="http://schemas.microsoft.com/office/drawing/2015/10/21/chartex" xmlns:cx3="http://schemas.microsoft.com/office/drawing/2016/5/9/chartex" xmlns:cx4="http://schemas.microsoft.com/office/drawing/2016/5/10/chartex" xmlns:cx5="http://schemas.microsoft.com/office/drawing/2016/5/11/chartex" xmlns:cx6="http://schemas.microsoft.com/office/drawing/2016/5/12/chartex" xmlns:cx7="http://schemas.microsoft.com/office/drawing/2016/5/13/chartex" xmlns:cx8="http://schemas.microsoft.com/office/drawing/2016/5/14/chartex" xmlns:mc="http://schemas.openxmlformats.org/markup-compatibility/2006" xmlns:aink="http://schemas.microsoft.com/office/drawing/2016/ink" xmlns:am3d="http://schemas.microsoft.com/office/drawing/2017/model3d" xmlns:o="urn:schemas-microsoft-com:office:office" xmlns:oel="http://schemas.microsoft.com/office/2019/extlst" xmlns:r="http://schemas.openxmlformats.org/officeDocument/2006/relationships" xmlns:m="http://schemas.openxmlformats.org/officeDocument/2006/math" xmlns:v="urn:schemas-microsoft-com:vml" xmlns:wp14="http://schemas.microsoft.com/office/word/2010/wordprocessingDrawing" xmlns:wp="http://schemas.openxmlformats.org/drawingml/2006/wordprocessingDrawing" xmlns:w10="urn:schemas-microsoft-com:office:word" xmlns:w="http://schemas.openxmlformats.org/wordprocessingml/2006/main" xmlns:w14="http://schemas.microsoft.com/office/word/2010/wordml" xmlns:w15="http://schemas.microsoft.com/office/word/2012/wordml" xmlns:w16cex="http://schemas.microsoft.com/office/word/2018/wordml/cex" xmlns:w16cid="http://schemas.microsoft.com/office/word/2016/wordml/cid" xmlns:w16="http://schemas.microsoft.com/office/word/2018/wordml" xmlns:w16du="http://schemas.microsoft.com/office/word/2023/wordml/word16du" xmlns:w16sdtdh="http://schemas.microsoft.com/office/word/2020/wordml/sdtdatahash" xmlns:w16sdtfl="http://schemas.microsoft.com/office/word/2024/wordml/sdtformatlock" xmlns:w16se="http://schemas.microsoft.com/office/word/2015/wordml/symex" xmlns:wpg="http://schemas.microsoft.com/office/word/2010/wordprocessingGroup" xmlns:wpi="http://schemas.microsoft.com/office/word/2010/wordprocessingInk" xmlns:wne="http://schemas.microsoft.com/office/word/2006/wordml" xmlns:wps="http://schemas.microsoft.com/office/word/2010/wordprocessingShape" mc:Ignorable="w14 w15 w16se w16cid w16 w16cex w16sdtdh w16sdtfl w16du wp14">
+<w:numbering xmlns:wpc="http://schemas.microsoft.com/office/word/2010/wordprocessingCanvas" xmlns:cx="http://schemas.microsoft.com/office/drawing/2014/chartex" xmlns:cx1="http://schemas.microsoft.com/office/drawing/2015/9/8/chartex" xmlns:cx2="http://schemas.microsoft.com/office/drawing/2015/10/21/chartex" xmlns:cx3="http://schemas.microsoft.com/office/drawing/2016/5/9/chartex" xmlns:cx4="http://schemas.microsoft.com/office/drawing/2016/5/10/chartex" xmlns:cx5="http://schemas.microsoft.com/office/drawing/2016/5/11/chartex" xmlns:cx6="http://schemas.microsoft.com/office/drawing/2016/5/12/chartex" xmlns:cx7="http://schemas.microsoft.com/office/drawing/2016/5/13/chartex" xmlns:cx8="http://schemas.microsoft.com/office/drawing/2016/5/14/chartex" xmlns:mc="http://schemas.openxmlformats.org/markup-compatibility/2006" xmlns:m="http://schemas.openxmlformats.org/officeDocument/2006/math" xmlns:aink="http://schemas.microsoft.com/office/drawing/2016/ink" xmlns:am3d="http://schemas.microsoft.com/office/drawing/2017/model3d" xmlns:oel="http://schemas.microsoft.com/office/2019/extlst" xmlns:r="http://schemas.openxmlformats.org/officeDocument/2006/relationships" xmlns:wp14="http://schemas.microsoft.com/office/word/2010/wordprocessingDrawing" xmlns:wp="http://schemas.openxmlformats.org/drawingml/2006/wordprocessingDrawing" xmlns:wpg="http://schemas.microsoft.com/office/word/2010/wordprocessingGroup" xmlns:wpi="http://schemas.microsoft.com/office/word/2010/wordprocessingInk" xmlns:wps="http://schemas.microsoft.com/office/word/2010/wordprocessingShape" xmlns:o="urn:schemas-microsoft-com:office:office" xmlns:v="urn:schemas-microsoft-com:vml" xmlns:w10="urn:schemas-microsoft-com:office:word" xmlns:w="http://schemas.openxmlformats.org/wordprocessingml/2006/main" xmlns:w14="http://schemas.microsoft.com/office/word/2010/wordml" xmlns:w15="http://schemas.microsoft.com/office/word/2012/wordml" xmlns:w16cei="http://schemas.microsoft.com/office/word/2026/wordml/cei" xmlns:w16cex="http://schemas.microsoft.com/office/word/2018/wordml/cex" xmlns:w16cid="http://schemas.microsoft.com/office/word/2016/wordml/cid" xmlns:w16="http://schemas.microsoft.com/office/word/2018/wordml" xmlns:w16sdtdh="http://schemas.microsoft.com/office/word/2020/wordml/sdtdatahash" xmlns:w16sdtfl="http://schemas.microsoft.com/office/word/2024/wordml/sdtformatlock" xmlns:w16se="http://schemas.microsoft.com/office/word/2015/wordml/symex" xmlns:w16du="http://schemas.microsoft.com/office/word/2023/wordml/word16du" xmlns:wne="http://schemas.microsoft.com/office/word/2006/wordml" mc:Ignorable="w14 w15 w16se w16cid w16 w16cex w16sdtdh w16sdtfl w16du wp14">
   <w:abstractNum w:abstractNumId="0" w15:restartNumberingAfterBreak="0">
     <w:nsid w:val="128C3758"/>
     <w:multiLevelType w:val="hybridMultilevel"/>
@@ -2394,7 +2348,7 @@
 </file>
 
 <file path=word/styles.xml><?xml version="1.0" encoding="utf-8"?>
-<w:styles xmlns:mc="http://schemas.openxmlformats.org/markup-compatibility/2006" xmlns:r="http://schemas.openxmlformats.org/officeDocument/2006/relationships" xmlns:w="http://schemas.openxmlformats.org/wordprocessingml/2006/main" xmlns:w14="http://schemas.microsoft.com/office/word/2010/wordml" xmlns:w15="http://schemas.microsoft.com/office/word/2012/wordml" xmlns:w16cex="http://schemas.microsoft.com/office/word/2018/wordml/cex" xmlns:w16cid="http://schemas.microsoft.com/office/word/2016/wordml/cid" xmlns:w16="http://schemas.microsoft.com/office/word/2018/wordml" xmlns:w16du="http://schemas.microsoft.com/office/word/2023/wordml/word16du" xmlns:w16sdtdh="http://schemas.microsoft.com/office/word/2020/wordml/sdtdatahash" xmlns:w16sdtfl="http://schemas.microsoft.com/office/word/2024/wordml/sdtformatlock" xmlns:w16se="http://schemas.microsoft.com/office/word/2015/wordml/symex" mc:Ignorable="w14 w15 w16se w16cid w16 w16cex w16sdtdh w16sdtfl w16du">
+<w:styles xmlns:mc="http://schemas.openxmlformats.org/markup-compatibility/2006" xmlns:r="http://schemas.openxmlformats.org/officeDocument/2006/relationships" xmlns:w="http://schemas.openxmlformats.org/wordprocessingml/2006/main" xmlns:w14="http://schemas.microsoft.com/office/word/2010/wordml" xmlns:w15="http://schemas.microsoft.com/office/word/2012/wordml" xmlns:w16cex="http://schemas.microsoft.com/office/word/2018/wordml/cex" xmlns:w16cid="http://schemas.microsoft.com/office/word/2016/wordml/cid" xmlns:w16="http://schemas.microsoft.com/office/word/2018/wordml" xmlns:w16sdtdh="http://schemas.microsoft.com/office/word/2020/wordml/sdtdatahash" xmlns:w16sdtfl="http://schemas.microsoft.com/office/word/2024/wordml/sdtformatlock" xmlns:w16se="http://schemas.microsoft.com/office/word/2015/wordml/symex" xmlns:w16du="http://schemas.microsoft.com/office/word/2023/wordml/word16du" mc:Ignorable="w14 w15 w16se w16cid w16 w16cex w16sdtdh w16sdtfl w16du">
   <w:docDefaults>
     <w:rPrDefault>
       <w:rPr>
@@ -3459,68 +3413,8 @@
 </file>
 
 <file path=word/glossary/document.xml><?xml version="1.0" encoding="utf-8"?>
-<w:glossaryDocument xmlns:wpc="http://schemas.microsoft.com/office/word/2010/wordprocessingCanvas" xmlns:cx="http://schemas.microsoft.com/office/drawing/2014/chartex" xmlns:cx1="http://schemas.microsoft.com/office/drawing/2015/9/8/chartex" xmlns:cx2="http://schemas.microsoft.com/office/drawing/2015/10/21/chartex" xmlns:cx3="http://schemas.microsoft.com/office/drawing/2016/5/9/chartex" xmlns:cx4="http://schemas.microsoft.com/office/drawing/2016/5/10/chartex" xmlns:cx5="http://schemas.microsoft.com/office/drawing/2016/5/11/chartex" xmlns:cx6="http://schemas.microsoft.com/office/drawing/2016/5/12/chartex" xmlns:cx7="http://schemas.microsoft.com/office/drawing/2016/5/13/chartex" xmlns:cx8="http://schemas.microsoft.com/office/drawing/2016/5/14/chartex" xmlns:mc="http://schemas.openxmlformats.org/markup-compatibility/2006" xmlns:aink="http://schemas.microsoft.com/office/drawing/2016/ink" xmlns:am3d="http://schemas.microsoft.com/office/drawing/2017/model3d" xmlns:o="urn:schemas-microsoft-com:office:office" xmlns:oel="http://schemas.microsoft.com/office/2019/extlst" xmlns:r="http://schemas.openxmlformats.org/officeDocument/2006/relationships" xmlns:m="http://schemas.openxmlformats.org/officeDocument/2006/math" xmlns:v="urn:schemas-microsoft-com:vml" xmlns:wp14="http://schemas.microsoft.com/office/word/2010/wordprocessingDrawing" xmlns:wp="http://schemas.openxmlformats.org/drawingml/2006/wordprocessingDrawing" xmlns:w10="urn:schemas-microsoft-com:office:word" xmlns:w="http://schemas.openxmlformats.org/wordprocessingml/2006/main" xmlns:w14="http://schemas.microsoft.com/office/word/2010/wordml" xmlns:w15="http://schemas.microsoft.com/office/word/2012/wordml" xmlns:w16cex="http://schemas.microsoft.com/office/word/2018/wordml/cex" xmlns:w16cid="http://schemas.microsoft.com/office/word/2016/wordml/cid" xmlns:w16="http://schemas.microsoft.com/office/word/2018/wordml" xmlns:w16du="http://schemas.microsoft.com/office/word/2023/wordml/word16du" xmlns:w16sdtdh="http://schemas.microsoft.com/office/word/2020/wordml/sdtdatahash" xmlns:w16sdtfl="http://schemas.microsoft.com/office/word/2024/wordml/sdtformatlock" xmlns:w16se="http://schemas.microsoft.com/office/word/2015/wordml/symex" xmlns:wpg="http://schemas.microsoft.com/office/word/2010/wordprocessingGroup" xmlns:wpi="http://schemas.microsoft.com/office/word/2010/wordprocessingInk" xmlns:wne="http://schemas.microsoft.com/office/word/2006/wordml" xmlns:wps="http://schemas.microsoft.com/office/word/2010/wordprocessingShape" mc:Ignorable="w14 w15 w16se w16cid w16 w16cex w16sdtdh w16sdtfl w16du wp14">
+<w:glossaryDocument xmlns:wpc="http://schemas.microsoft.com/office/word/2010/wordprocessingCanvas" xmlns:cx="http://schemas.microsoft.com/office/drawing/2014/chartex" xmlns:cx1="http://schemas.microsoft.com/office/drawing/2015/9/8/chartex" xmlns:cx2="http://schemas.microsoft.com/office/drawing/2015/10/21/chartex" xmlns:cx3="http://schemas.microsoft.com/office/drawing/2016/5/9/chartex" xmlns:cx4="http://schemas.microsoft.com/office/drawing/2016/5/10/chartex" xmlns:cx5="http://schemas.microsoft.com/office/drawing/2016/5/11/chartex" xmlns:cx6="http://schemas.microsoft.com/office/drawing/2016/5/12/chartex" xmlns:cx7="http://schemas.microsoft.com/office/drawing/2016/5/13/chartex" xmlns:cx8="http://schemas.microsoft.com/office/drawing/2016/5/14/chartex" xmlns:mc="http://schemas.openxmlformats.org/markup-compatibility/2006" xmlns:m="http://schemas.openxmlformats.org/officeDocument/2006/math" xmlns:aink="http://schemas.microsoft.com/office/drawing/2016/ink" xmlns:am3d="http://schemas.microsoft.com/office/drawing/2017/model3d" xmlns:oel="http://schemas.microsoft.com/office/2019/extlst" xmlns:r="http://schemas.openxmlformats.org/officeDocument/2006/relationships" xmlns:wp14="http://schemas.microsoft.com/office/word/2010/wordprocessingDrawing" xmlns:wp="http://schemas.openxmlformats.org/drawingml/2006/wordprocessingDrawing" xmlns:wpg="http://schemas.microsoft.com/office/word/2010/wordprocessingGroup" xmlns:wpi="http://schemas.microsoft.com/office/word/2010/wordprocessingInk" xmlns:wps="http://schemas.microsoft.com/office/word/2010/wordprocessingShape" xmlns:o="urn:schemas-microsoft-com:office:office" xmlns:v="urn:schemas-microsoft-com:vml" xmlns:w10="urn:schemas-microsoft-com:office:word" xmlns:w="http://schemas.openxmlformats.org/wordprocessingml/2006/main" xmlns:w14="http://schemas.microsoft.com/office/word/2010/wordml" xmlns:w15="http://schemas.microsoft.com/office/word/2012/wordml" xmlns:w16cei="http://schemas.microsoft.com/office/word/2026/wordml/cei" xmlns:w16cex="http://schemas.microsoft.com/office/word/2018/wordml/cex" xmlns:w16cid="http://schemas.microsoft.com/office/word/2016/wordml/cid" xmlns:w16="http://schemas.microsoft.com/office/word/2018/wordml" xmlns:w16sdtdh="http://schemas.microsoft.com/office/word/2020/wordml/sdtdatahash" xmlns:w16sdtfl="http://schemas.microsoft.com/office/word/2024/wordml/sdtformatlock" xmlns:w16se="http://schemas.microsoft.com/office/word/2015/wordml/symex" xmlns:w16du="http://schemas.microsoft.com/office/word/2023/wordml/word16du" xmlns:wne="http://schemas.microsoft.com/office/word/2006/wordml" mc:Ignorable="w14 w15 w16se w16cid w16 w16cex w16sdtdh w16sdtfl w16du wp14">
   <w:docParts>
-    <w:docPart>
-      <w:docPartPr>
-        <w:name w:val="FB80503417AF4E04B5347EC496624C8D"/>
-        <w:category>
-          <w:name w:val="Allgemein"/>
-          <w:gallery w:val="placeholder"/>
-        </w:category>
-        <w:types>
-          <w:type w:val="bbPlcHdr"/>
-        </w:types>
-        <w:behaviors>
-          <w:behavior w:val="content"/>
-        </w:behaviors>
-        <w:guid w:val="{626142A1-8E6F-4997-8D5A-3ACC0D569045}"/>
-      </w:docPartPr>
-      <w:docPartBody>
-        <w:p>
-          <w:pPr>
-            <w:pStyle w:val="FB80503417AF4E04B5347EC496624C8D"/>
-          </w:pPr>
-          <w:r>
-            <w:rPr>
-              <w:b/>
-              <w:lang w:val="de-DE"/>
-            </w:rPr>
-            <w:t>Bitte eintragen</w:t>
-          </w:r>
-        </w:p>
-      </w:docPartBody>
-    </w:docPart>
-    <w:docPart>
-      <w:docPartPr>
-        <w:name w:val="9E2DA37932E84E0486F2EAF7E55FCDCB"/>
-        <w:category>
-          <w:name w:val="Allgemein"/>
-          <w:gallery w:val="placeholder"/>
-        </w:category>
-        <w:types>
-          <w:type w:val="bbPlcHdr"/>
-        </w:types>
-        <w:behaviors>
-          <w:behavior w:val="content"/>
-        </w:behaviors>
-        <w:guid w:val="{243ABC67-8190-4A4F-AFD0-C7C35ACF7661}"/>
-      </w:docPartPr>
-      <w:docPartBody>
-        <w:p>
-          <w:pPr>
-            <w:pStyle w:val="9E2DA37932E84E0486F2EAF7E55FCDCB"/>
-          </w:pPr>
-          <w:r>
-            <w:rPr>
-              <w:b/>
-              <w:lang w:val="de-DE"/>
-            </w:rPr>
-            <w:t>Bitte eintragen</w:t>
-          </w:r>
-        </w:p>
-      </w:docPartBody>
-    </w:docPart>
     <w:docPart>
       <w:docPartPr>
         <w:name w:val="303DCED8FF014991BB94D05FB00340FA"/>
@@ -3556,7 +3450,7 @@
 </file>
 
 <file path=word/glossary/fontTable.xml><?xml version="1.0" encoding="utf-8"?>
-<w:fonts xmlns:mc="http://schemas.openxmlformats.org/markup-compatibility/2006" xmlns:r="http://schemas.openxmlformats.org/officeDocument/2006/relationships" xmlns:w="http://schemas.openxmlformats.org/wordprocessingml/2006/main" xmlns:w14="http://schemas.microsoft.com/office/word/2010/wordml" xmlns:w15="http://schemas.microsoft.com/office/word/2012/wordml" xmlns:w16cex="http://schemas.microsoft.com/office/word/2018/wordml/cex" xmlns:w16cid="http://schemas.microsoft.com/office/word/2016/wordml/cid" xmlns:w16="http://schemas.microsoft.com/office/word/2018/wordml" xmlns:w16du="http://schemas.microsoft.com/office/word/2023/wordml/word16du" xmlns:w16sdtdh="http://schemas.microsoft.com/office/word/2020/wordml/sdtdatahash" xmlns:w16sdtfl="http://schemas.microsoft.com/office/word/2024/wordml/sdtformatlock" xmlns:w16se="http://schemas.microsoft.com/office/word/2015/wordml/symex" mc:Ignorable="w14 w15 w16se w16cid w16 w16cex w16sdtdh w16sdtfl w16du">
+<w:fonts xmlns:mc="http://schemas.openxmlformats.org/markup-compatibility/2006" xmlns:r="http://schemas.openxmlformats.org/officeDocument/2006/relationships" xmlns:w="http://schemas.openxmlformats.org/wordprocessingml/2006/main" xmlns:w14="http://schemas.microsoft.com/office/word/2010/wordml" xmlns:w15="http://schemas.microsoft.com/office/word/2012/wordml" xmlns:w16cex="http://schemas.microsoft.com/office/word/2018/wordml/cex" xmlns:w16cid="http://schemas.microsoft.com/office/word/2016/wordml/cid" xmlns:w16="http://schemas.microsoft.com/office/word/2018/wordml" xmlns:w16sdtdh="http://schemas.microsoft.com/office/word/2020/wordml/sdtdatahash" xmlns:w16sdtfl="http://schemas.microsoft.com/office/word/2024/wordml/sdtformatlock" xmlns:w16se="http://schemas.microsoft.com/office/word/2015/wordml/symex" xmlns:w16du="http://schemas.microsoft.com/office/word/2023/wordml/word16du" mc:Ignorable="w14 w15 w16se w16cid w16 w16cex w16sdtdh w16sdtfl w16du">
   <w:font w:name="Frutiger 45 light">
     <w:altName w:val="Calibri"/>
     <w:panose1 w:val="020B0604020202020204"/>
@@ -3656,7 +3550,7 @@
 </file>
 
 <file path=word/glossary/settings.xml><?xml version="1.0" encoding="utf-8"?>
-<w:settings xmlns:mc="http://schemas.openxmlformats.org/markup-compatibility/2006" xmlns:o="urn:schemas-microsoft-com:office:office" xmlns:r="http://schemas.openxmlformats.org/officeDocument/2006/relationships" xmlns:m="http://schemas.openxmlformats.org/officeDocument/2006/math" xmlns:v="urn:schemas-microsoft-com:vml" xmlns:w10="urn:schemas-microsoft-com:office:word" xmlns:w="http://schemas.openxmlformats.org/wordprocessingml/2006/main" xmlns:w14="http://schemas.microsoft.com/office/word/2010/wordml" xmlns:w15="http://schemas.microsoft.com/office/word/2012/wordml" xmlns:w16cex="http://schemas.microsoft.com/office/word/2018/wordml/cex" xmlns:w16cid="http://schemas.microsoft.com/office/word/2016/wordml/cid" xmlns:w16="http://schemas.microsoft.com/office/word/2018/wordml" xmlns:w16du="http://schemas.microsoft.com/office/word/2023/wordml/word16du" xmlns:w16sdtdh="http://schemas.microsoft.com/office/word/2020/wordml/sdtdatahash" xmlns:w16sdtfl="http://schemas.microsoft.com/office/word/2024/wordml/sdtformatlock" xmlns:w16se="http://schemas.microsoft.com/office/word/2015/wordml/symex" xmlns:sl="http://schemas.openxmlformats.org/schemaLibrary/2006/main" mc:Ignorable="w14 w15 w16se w16cid w16 w16cex w16sdtdh w16sdtfl w16du">
+<w:settings xmlns:mc="http://schemas.openxmlformats.org/markup-compatibility/2006" xmlns:m="http://schemas.openxmlformats.org/officeDocument/2006/math" xmlns:r="http://schemas.openxmlformats.org/officeDocument/2006/relationships" xmlns:sl="http://schemas.openxmlformats.org/schemaLibrary/2006/main" xmlns:o="urn:schemas-microsoft-com:office:office" xmlns:v="urn:schemas-microsoft-com:vml" xmlns:w10="urn:schemas-microsoft-com:office:word" xmlns:w="http://schemas.openxmlformats.org/wordprocessingml/2006/main" xmlns:w14="http://schemas.microsoft.com/office/word/2010/wordml" xmlns:w15="http://schemas.microsoft.com/office/word/2012/wordml" xmlns:w16cex="http://schemas.microsoft.com/office/word/2018/wordml/cex" xmlns:w16cid="http://schemas.microsoft.com/office/word/2016/wordml/cid" xmlns:w16="http://schemas.microsoft.com/office/word/2018/wordml" xmlns:w16sdtdh="http://schemas.microsoft.com/office/word/2020/wordml/sdtdatahash" xmlns:w16sdtfl="http://schemas.microsoft.com/office/word/2024/wordml/sdtformatlock" xmlns:w16se="http://schemas.microsoft.com/office/word/2015/wordml/symex" xmlns:w16du="http://schemas.microsoft.com/office/word/2023/wordml/word16du" mc:Ignorable="w14 w15 w16se w16cid w16 w16cex w16sdtdh w16sdtfl w16du">
   <w:view w:val="normal"/>
   <w:defaultTabStop w:val="708"/>
   <w:hyphenationZone w:val="425"/>
@@ -3687,10 +3581,12 @@
     <w:rsid w:val="008E16A8"/>
     <w:rsid w:val="00905505"/>
     <w:rsid w:val="009227D1"/>
+    <w:rsid w:val="00930769"/>
     <w:rsid w:val="009D1E39"/>
     <w:rsid w:val="00AE1952"/>
     <w:rsid w:val="00B0399F"/>
     <w:rsid w:val="00B05779"/>
+    <w:rsid w:val="00B24597"/>
     <w:rsid w:val="00CB31EE"/>
     <w:rsid w:val="00D20B28"/>
     <w:rsid w:val="00D6435E"/>
@@ -3721,7 +3617,7 @@
 </file>
 
 <file path=word/glossary/styles.xml><?xml version="1.0" encoding="utf-8"?>
-<w:styles xmlns:mc="http://schemas.openxmlformats.org/markup-compatibility/2006" xmlns:r="http://schemas.openxmlformats.org/officeDocument/2006/relationships" xmlns:w="http://schemas.openxmlformats.org/wordprocessingml/2006/main" xmlns:w14="http://schemas.microsoft.com/office/word/2010/wordml" xmlns:w15="http://schemas.microsoft.com/office/word/2012/wordml" xmlns:w16cex="http://schemas.microsoft.com/office/word/2018/wordml/cex" xmlns:w16cid="http://schemas.microsoft.com/office/word/2016/wordml/cid" xmlns:w16="http://schemas.microsoft.com/office/word/2018/wordml" xmlns:w16du="http://schemas.microsoft.com/office/word/2023/wordml/word16du" xmlns:w16sdtdh="http://schemas.microsoft.com/office/word/2020/wordml/sdtdatahash" xmlns:w16sdtfl="http://schemas.microsoft.com/office/word/2024/wordml/sdtformatlock" xmlns:w16se="http://schemas.microsoft.com/office/word/2015/wordml/symex" mc:Ignorable="w14 w15 w16se w16cid w16 w16cex w16sdtdh w16sdtfl w16du">
+<w:styles xmlns:mc="http://schemas.openxmlformats.org/markup-compatibility/2006" xmlns:r="http://schemas.openxmlformats.org/officeDocument/2006/relationships" xmlns:w="http://schemas.openxmlformats.org/wordprocessingml/2006/main" xmlns:w14="http://schemas.microsoft.com/office/word/2010/wordml" xmlns:w15="http://schemas.microsoft.com/office/word/2012/wordml" xmlns:w16cex="http://schemas.microsoft.com/office/word/2018/wordml/cex" xmlns:w16cid="http://schemas.microsoft.com/office/word/2016/wordml/cid" xmlns:w16="http://schemas.microsoft.com/office/word/2018/wordml" xmlns:w16sdtdh="http://schemas.microsoft.com/office/word/2020/wordml/sdtdatahash" xmlns:w16sdtfl="http://schemas.microsoft.com/office/word/2024/wordml/sdtformatlock" xmlns:w16se="http://schemas.microsoft.com/office/word/2015/wordml/symex" xmlns:w16du="http://schemas.microsoft.com/office/word/2023/wordml/word16du" mc:Ignorable="w14 w15 w16se w16cid w16 w16cex w16sdtdh w16sdtfl w16du">
   <w:docDefaults>
     <w:rPrDefault>
       <w:rPr>
@@ -4184,20 +4080,6 @@
       <w:lang w:val="en-GB" w:eastAsia="en-US"/>
     </w:rPr>
   </w:style>
-  <w:style w:type="paragraph" w:customStyle="1" w:styleId="857459029BA2489D978EA4D05F73B12C1">
-    <w:name w:val="857459029BA2489D978EA4D05F73B12C1"/>
-    <w:rsid w:val="00873A48"/>
-    <w:pPr>
-      <w:spacing w:after="0" w:line="260" w:lineRule="exact"/>
-    </w:pPr>
-    <w:rPr>
-      <w:rFonts w:eastAsiaTheme="minorHAnsi"/>
-      <w:color w:val="000000" w:themeColor="text1"/>
-      <w:sz w:val="20"/>
-      <w:szCs w:val="21"/>
-      <w:lang w:val="en-GB" w:eastAsia="en-US"/>
-    </w:rPr>
-  </w:style>
   <w:style w:type="paragraph" w:customStyle="1" w:styleId="303DCED8FF014991BB94D05FB00340FA1">
     <w:name w:val="303DCED8FF014991BB94D05FB00340FA1"/>
     <w:rsid w:val="00873A48"/>
@@ -4216,7 +4098,7 @@
 </file>
 
 <file path=word/glossary/webSettings.xml><?xml version="1.0" encoding="utf-8"?>
-<w:webSettings xmlns:mc="http://schemas.openxmlformats.org/markup-compatibility/2006" xmlns:r="http://schemas.openxmlformats.org/officeDocument/2006/relationships" xmlns:w="http://schemas.openxmlformats.org/wordprocessingml/2006/main" xmlns:w14="http://schemas.microsoft.com/office/word/2010/wordml" xmlns:w15="http://schemas.microsoft.com/office/word/2012/wordml" xmlns:w16cex="http://schemas.microsoft.com/office/word/2018/wordml/cex" xmlns:w16cid="http://schemas.microsoft.com/office/word/2016/wordml/cid" xmlns:w16="http://schemas.microsoft.com/office/word/2018/wordml" xmlns:w16du="http://schemas.microsoft.com/office/word/2023/wordml/word16du" xmlns:w16sdtdh="http://schemas.microsoft.com/office/word/2020/wordml/sdtdatahash" xmlns:w16sdtfl="http://schemas.microsoft.com/office/word/2024/wordml/sdtformatlock" xmlns:w16se="http://schemas.microsoft.com/office/word/2015/wordml/symex" mc:Ignorable="w14 w15 w16se w16cid w16 w16cex w16sdtdh w16sdtfl w16du">
+<w:webSettings xmlns:mc="http://schemas.openxmlformats.org/markup-compatibility/2006" xmlns:r="http://schemas.openxmlformats.org/officeDocument/2006/relationships" xmlns:w="http://schemas.openxmlformats.org/wordprocessingml/2006/main" xmlns:w14="http://schemas.microsoft.com/office/word/2010/wordml" xmlns:w15="http://schemas.microsoft.com/office/word/2012/wordml" xmlns:w16cex="http://schemas.microsoft.com/office/word/2018/wordml/cex" xmlns:w16cid="http://schemas.microsoft.com/office/word/2016/wordml/cid" xmlns:w16="http://schemas.microsoft.com/office/word/2018/wordml" xmlns:w16sdtdh="http://schemas.microsoft.com/office/word/2020/wordml/sdtdatahash" xmlns:w16sdtfl="http://schemas.microsoft.com/office/word/2024/wordml/sdtformatlock" xmlns:w16se="http://schemas.microsoft.com/office/word/2015/wordml/symex" xmlns:w16du="http://schemas.microsoft.com/office/word/2023/wordml/word16du" mc:Ignorable="w14 w15 w16se w16cid w16 w16cex w16sdtdh w16sdtfl w16du">
   <w:optimizeForBrowser/>
   <w:allowPNG/>
 </w:webSettings>

</xml_diff>